<commit_message>
Canon: remove big-idea slogan contrast, align with deck
Big idea "управляешь…, не угадываешь промптами" → affirmative
"управляешь ИИ через спецификацию и контроль качества" (program-and-outcomes,
site index/workspace, W8 plan). Dropped "а не …" tails in landing-program cards.
Rebuilt docx 01/10/11, re-uploaded to Drive.

Co-Authored-By: Claude Opus 4.8 <noreply@anthropic.com>
</commit_message>
<xml_diff>
--- a/05-google-docs/11_Программа-для-лендинга.docx
+++ b/05-google-docs/11_Программа-для-лендинга.docx
@@ -404,7 +404,7 @@
       </w:r>
       <w:r>
         <w:br/>
-        <w:t>Будете ловить типовые дефекты AI-кода до мерджа — по чек-листу, а не интуицией. Ядро курса и самый востребованный навык в командах, работающих с ИИ.</w:t>
+        <w:t>Будете ловить типовые дефекты AI-кода до мерджа — по чек-листу. Ядро курса и самый востребованный навык в командах, работающих с ИИ.</w:t>
       </w:r>
     </w:p>
     <w:p>
@@ -467,7 +467,7 @@
       </w:r>
       <w:r>
         <w:br/>
-        <w:t>Докажете работоспособность AI-кода тестами и CI, а не словами. Coverage станет критерием готовности — без самообмана зелёными галочками.</w:t>
+        <w:t>Докажете работоспособность AI-кода тестами и CI. Coverage станет критерием готовности — без самообмана зелёными галочками.</w:t>
       </w:r>
     </w:p>
     <w:p>
@@ -561,7 +561,7 @@
       </w:r>
       <w:r>
         <w:br/>
-        <w:t>- Узнаете, как доказать управление ИИ артефактами процесса, а не словами «оно работает»;</w:t>
+        <w:t>- Узнаете, как доказать управление ИИ артефактами процесса;</w:t>
         <w:br/>
         <w:t>- Разберёте рубрику защиты из 6 критериев; поймёте, какие элементы цикла сжимаются до минут, а какие обязательны всегда.</w:t>
       </w:r>

</xml_diff>